<commit_message>
Add team members to the cover page of all documents
Co-Authored-By: Claude Sonnet 5.5 <noreply@anthropic.com>
</commit_message>
<xml_diff>
--- a/docs/MeetingAI_Code_Walkthrough.docx
+++ b/docs/MeetingAI_Code_Walkthrough.docx
@@ -176,6 +176,108 @@
                 <w:sz w:val="18"/>
               </w:rPr>
               <w:t>October 2026</w:t>
+            </w:r>
+          </w:p>
+          <w:p>
+            <w:pPr>
+              <w:spacing w:before="200" w:after="0"/>
+            </w:pPr>
+            <w:r>
+              <w:rPr>
+                <w:rFonts w:ascii="Segoe UI" w:hAnsi="Segoe UI"/>
+                <w:b/>
+                <w:color w:val="8E99E0"/>
+                <w:sz w:val="15"/>
+              </w:rPr>
+              <w:t>TEAM MEMBERS</w:t>
+            </w:r>
+          </w:p>
+          <w:p>
+            <w:pPr>
+              <w:spacing w:after="0"/>
+            </w:pPr>
+            <w:r>
+              <w:rPr>
+                <w:rFonts w:ascii="Segoe UI" w:hAnsi="Segoe UI"/>
+                <w:color w:val="FFFFFF"/>
+                <w:sz w:val="19"/>
+              </w:rPr>
+              <w:t xml:space="preserve">Nidhi Tiwari  </w:t>
+            </w:r>
+            <w:r>
+              <w:rPr>
+                <w:rFonts w:ascii="Segoe UI" w:hAnsi="Segoe UI"/>
+                <w:b/>
+                <w:color w:val="A78BFA"/>
+                <w:sz w:val="19"/>
+              </w:rPr>
+              <w:t>A033</w:t>
+            </w:r>
+          </w:p>
+          <w:p>
+            <w:pPr>
+              <w:spacing w:after="0"/>
+            </w:pPr>
+            <w:r>
+              <w:rPr>
+                <w:rFonts w:ascii="Segoe UI" w:hAnsi="Segoe UI"/>
+                <w:color w:val="FFFFFF"/>
+                <w:sz w:val="19"/>
+              </w:rPr>
+              <w:t xml:space="preserve">Dhruvi Devalia  </w:t>
+            </w:r>
+            <w:r>
+              <w:rPr>
+                <w:rFonts w:ascii="Segoe UI" w:hAnsi="Segoe UI"/>
+                <w:b/>
+                <w:color w:val="A78BFA"/>
+                <w:sz w:val="19"/>
+              </w:rPr>
+              <w:t>A044</w:t>
+            </w:r>
+          </w:p>
+          <w:p>
+            <w:pPr>
+              <w:spacing w:after="0"/>
+            </w:pPr>
+            <w:r>
+              <w:rPr>
+                <w:rFonts w:ascii="Segoe UI" w:hAnsi="Segoe UI"/>
+                <w:color w:val="FFFFFF"/>
+                <w:sz w:val="19"/>
+              </w:rPr>
+              <w:t xml:space="preserve">Jivesh Gawde  </w:t>
+            </w:r>
+            <w:r>
+              <w:rPr>
+                <w:rFonts w:ascii="Segoe UI" w:hAnsi="Segoe UI"/>
+                <w:b/>
+                <w:color w:val="A78BFA"/>
+                <w:sz w:val="19"/>
+              </w:rPr>
+              <w:t>A057</w:t>
+            </w:r>
+          </w:p>
+          <w:p>
+            <w:pPr>
+              <w:spacing w:after="0"/>
+            </w:pPr>
+            <w:r>
+              <w:rPr>
+                <w:rFonts w:ascii="Segoe UI" w:hAnsi="Segoe UI"/>
+                <w:color w:val="FFFFFF"/>
+                <w:sz w:val="19"/>
+              </w:rPr>
+              <w:t xml:space="preserve">Yashika Parmar  </w:t>
+            </w:r>
+            <w:r>
+              <w:rPr>
+                <w:rFonts w:ascii="Segoe UI" w:hAnsi="Segoe UI"/>
+                <w:b/>
+                <w:color w:val="A78BFA"/>
+                <w:sz w:val="19"/>
+              </w:rPr>
+              <w:t>A061</w:t>
             </w:r>
           </w:p>
         </w:tc>

</xml_diff>